<commit_message>
Finished Chapter 2 homework
</commit_message>
<xml_diff>
--- a/HTML_CSS/Homework/HTML_CH02_HW/HTML_CH02_HW.docx
+++ b/HTML_CSS/Homework/HTML_CH02_HW/HTML_CH02_HW.docx
@@ -12,15 +12,7 @@
           <w:b/>
           <w:sz w:val="60"/>
         </w:rPr>
-        <w:t xml:space="preserve">Chapter </w:t>
-      </w:r>
-      <w:r>
-        <w:rPr>
-          <w:rFonts w:ascii="Calibri" w:eastAsia="Calibri" w:hAnsi="Calibri" w:cs="Calibri"/>
-          <w:b/>
-          <w:sz w:val="60"/>
-        </w:rPr>
-        <w:t>2 Homework</w:t>
+        <w:t>Chapter 2 Homework</w:t>
       </w:r>
     </w:p>
     <w:p>
@@ -82,15 +74,7 @@
     </w:p>
     <w:p>
       <w:r>
-        <w:t xml:space="preserve">Inside your </w:t>
-      </w:r>
-      <w:proofErr w:type="spellStart"/>
-      <w:r>
-        <w:t>git</w:t>
-      </w:r>
-      <w:proofErr w:type="spellEnd"/>
-      <w:r>
-        <w:t xml:space="preserve"> repo, use the folder named HTML_CH0</w:t>
+        <w:t>Inside your git repo, use the folder named HTML_CH0</w:t>
       </w:r>
       <w:r>
         <w:t>2</w:t>
@@ -108,7 +92,13 @@
         </w:numPr>
       </w:pPr>
       <w:r>
-        <w:t xml:space="preserve">Inside of your chapter 3 homework folder, create an HTML page named </w:t>
+        <w:t xml:space="preserve">Inside of your chapter </w:t>
+      </w:r>
+      <w:r>
+        <w:t>2</w:t>
+      </w:r>
+      <w:r>
+        <w:t xml:space="preserve"> homework folder, create an HTML page named </w:t>
       </w:r>
       <w:r>
         <w:t>index</w:t>
@@ -323,15 +313,7 @@
         </w:numPr>
       </w:pPr>
       <w:r>
-        <w:t>A list (&lt;ul&gt; or &lt;</w:t>
-      </w:r>
-      <w:proofErr w:type="spellStart"/>
-      <w:r>
-        <w:t>ol</w:t>
-      </w:r>
-      <w:proofErr w:type="spellEnd"/>
-      <w:r>
-        <w:t xml:space="preserve">&gt; or extra paragraph </w:t>
+        <w:t xml:space="preserve">A list (&lt;ul&gt; or &lt;ol&gt; or extra paragraph </w:t>
       </w:r>
       <w:r>
         <w:rPr>
@@ -1797,6 +1779,7 @@
   <w:style w:type="character" w:default="1" w:styleId="DefaultParagraphFont">
     <w:name w:val="Default Paragraph Font"/>
     <w:uiPriority w:val="1"/>
+    <w:semiHidden/>
     <w:unhideWhenUsed/>
   </w:style>
   <w:style w:type="table" w:default="1" w:styleId="TableNormal">

</xml_diff>